<commit_message>
improve report: natural language rewrite + chart rationale + fix refs
</commit_message>
<xml_diff>
--- a/2308080119+王睿彬+数据源码/report/2308080119+王睿彬+数据源码.docx
+++ b/2308080119+王睿彬+数据源码/report/2308080119+王睿彬+数据源码.docx
@@ -52,11 +52,17 @@
       </w:tblGrid>
       <w:tr>
         <w:trPr>
-          <w:trHeight w:val="680"/>
+          <w:trHeight w:val="510"/>
         </w:trPr>
         <w:tc>
           <w:tcPr>
-            <w:tcW w:type="dxa" w:w="2268"/>
+            <w:tcW w:type="dxa" w:w="1814"/>
+            <w:tcMar>
+              <w:top w:w="0" w:type="dxa"/>
+              <w:left w:w="0" w:type="dxa"/>
+              <w:bottom w:w="0" w:type="dxa"/>
+              <w:right w:w="0" w:type="dxa"/>
+            </w:tcMar>
             <w:tcBorders>
               <w:top w:val="none" w:sz="0" w:space="0" w:color="auto"/>
               <w:left w:val="none" w:sz="0" w:space="0" w:color="auto"/>
@@ -81,8 +87,14 @@
         <w:tc>
           <w:tcPr>
             <w:tcW w:type="dxa" w:w="4535"/>
+            <w:tcMar>
+              <w:top w:w="0" w:type="dxa"/>
+              <w:left w:w="0" w:type="dxa"/>
+              <w:bottom w:w="0" w:type="dxa"/>
+              <w:right w:w="0" w:type="dxa"/>
+            </w:tcMar>
             <w:tcBorders>
-              <w:bottom w:val="single" w:sz="12" w:space="1" w:color="000000"/>
+              <w:bottom w:val="single" w:sz="12" w:space="0" w:color="000000"/>
               <w:top w:val="none" w:sz="0" w:space="0" w:color="auto"/>
               <w:left w:val="none" w:sz="0" w:space="0" w:color="auto"/>
               <w:right w:val="none" w:sz="0" w:space="0" w:color="auto"/>
@@ -106,11 +118,17 @@
       </w:tr>
       <w:tr>
         <w:trPr>
-          <w:trHeight w:val="680"/>
+          <w:trHeight w:val="510"/>
         </w:trPr>
         <w:tc>
           <w:tcPr>
-            <w:tcW w:type="dxa" w:w="2268"/>
+            <w:tcW w:type="dxa" w:w="1814"/>
+            <w:tcMar>
+              <w:top w:w="0" w:type="dxa"/>
+              <w:left w:w="0" w:type="dxa"/>
+              <w:bottom w:w="0" w:type="dxa"/>
+              <w:right w:w="0" w:type="dxa"/>
+            </w:tcMar>
             <w:tcBorders>
               <w:top w:val="none" w:sz="0" w:space="0" w:color="auto"/>
               <w:left w:val="none" w:sz="0" w:space="0" w:color="auto"/>
@@ -135,8 +153,14 @@
         <w:tc>
           <w:tcPr>
             <w:tcW w:type="dxa" w:w="4535"/>
+            <w:tcMar>
+              <w:top w:w="0" w:type="dxa"/>
+              <w:left w:w="0" w:type="dxa"/>
+              <w:bottom w:w="0" w:type="dxa"/>
+              <w:right w:w="0" w:type="dxa"/>
+            </w:tcMar>
             <w:tcBorders>
-              <w:bottom w:val="single" w:sz="12" w:space="1" w:color="000000"/>
+              <w:bottom w:val="single" w:sz="12" w:space="0" w:color="000000"/>
               <w:top w:val="none" w:sz="0" w:space="0" w:color="auto"/>
               <w:left w:val="none" w:sz="0" w:space="0" w:color="auto"/>
               <w:right w:val="none" w:sz="0" w:space="0" w:color="auto"/>
@@ -160,11 +184,17 @@
       </w:tr>
       <w:tr>
         <w:trPr>
-          <w:trHeight w:val="680"/>
+          <w:trHeight w:val="510"/>
         </w:trPr>
         <w:tc>
           <w:tcPr>
-            <w:tcW w:type="dxa" w:w="2268"/>
+            <w:tcW w:type="dxa" w:w="1814"/>
+            <w:tcMar>
+              <w:top w:w="0" w:type="dxa"/>
+              <w:left w:w="0" w:type="dxa"/>
+              <w:bottom w:w="0" w:type="dxa"/>
+              <w:right w:w="0" w:type="dxa"/>
+            </w:tcMar>
             <w:tcBorders>
               <w:top w:val="none" w:sz="0" w:space="0" w:color="auto"/>
               <w:left w:val="none" w:sz="0" w:space="0" w:color="auto"/>
@@ -189,8 +219,14 @@
         <w:tc>
           <w:tcPr>
             <w:tcW w:type="dxa" w:w="4535"/>
+            <w:tcMar>
+              <w:top w:w="0" w:type="dxa"/>
+              <w:left w:w="0" w:type="dxa"/>
+              <w:bottom w:w="0" w:type="dxa"/>
+              <w:right w:w="0" w:type="dxa"/>
+            </w:tcMar>
             <w:tcBorders>
-              <w:bottom w:val="single" w:sz="12" w:space="1" w:color="000000"/>
+              <w:bottom w:val="single" w:sz="12" w:space="0" w:color="000000"/>
               <w:top w:val="none" w:sz="0" w:space="0" w:color="auto"/>
               <w:left w:val="none" w:sz="0" w:space="0" w:color="auto"/>
               <w:right w:val="none" w:sz="0" w:space="0" w:color="auto"/>
@@ -214,11 +250,17 @@
       </w:tr>
       <w:tr>
         <w:trPr>
-          <w:trHeight w:val="680"/>
+          <w:trHeight w:val="510"/>
         </w:trPr>
         <w:tc>
           <w:tcPr>
-            <w:tcW w:type="dxa" w:w="2268"/>
+            <w:tcW w:type="dxa" w:w="1814"/>
+            <w:tcMar>
+              <w:top w:w="0" w:type="dxa"/>
+              <w:left w:w="0" w:type="dxa"/>
+              <w:bottom w:w="0" w:type="dxa"/>
+              <w:right w:w="0" w:type="dxa"/>
+            </w:tcMar>
             <w:tcBorders>
               <w:top w:val="none" w:sz="0" w:space="0" w:color="auto"/>
               <w:left w:val="none" w:sz="0" w:space="0" w:color="auto"/>
@@ -243,8 +285,14 @@
         <w:tc>
           <w:tcPr>
             <w:tcW w:type="dxa" w:w="4535"/>
+            <w:tcMar>
+              <w:top w:w="0" w:type="dxa"/>
+              <w:left w:w="0" w:type="dxa"/>
+              <w:bottom w:w="0" w:type="dxa"/>
+              <w:right w:w="0" w:type="dxa"/>
+            </w:tcMar>
             <w:tcBorders>
-              <w:bottom w:val="single" w:sz="12" w:space="1" w:color="000000"/>
+              <w:bottom w:val="single" w:sz="12" w:space="0" w:color="000000"/>
               <w:top w:val="none" w:sz="0" w:space="0" w:color="auto"/>
               <w:left w:val="none" w:sz="0" w:space="0" w:color="auto"/>
               <w:right w:val="none" w:sz="0" w:space="0" w:color="auto"/>
@@ -268,11 +316,17 @@
       </w:tr>
       <w:tr>
         <w:trPr>
-          <w:trHeight w:val="680"/>
+          <w:trHeight w:val="510"/>
         </w:trPr>
         <w:tc>
           <w:tcPr>
-            <w:tcW w:type="dxa" w:w="2268"/>
+            <w:tcW w:type="dxa" w:w="1814"/>
+            <w:tcMar>
+              <w:top w:w="0" w:type="dxa"/>
+              <w:left w:w="0" w:type="dxa"/>
+              <w:bottom w:w="0" w:type="dxa"/>
+              <w:right w:w="0" w:type="dxa"/>
+            </w:tcMar>
             <w:tcBorders>
               <w:top w:val="none" w:sz="0" w:space="0" w:color="auto"/>
               <w:left w:val="none" w:sz="0" w:space="0" w:color="auto"/>
@@ -297,8 +351,14 @@
         <w:tc>
           <w:tcPr>
             <w:tcW w:type="dxa" w:w="4535"/>
+            <w:tcMar>
+              <w:top w:w="0" w:type="dxa"/>
+              <w:left w:w="0" w:type="dxa"/>
+              <w:bottom w:w="0" w:type="dxa"/>
+              <w:right w:w="0" w:type="dxa"/>
+            </w:tcMar>
             <w:tcBorders>
-              <w:bottom w:val="single" w:sz="12" w:space="1" w:color="000000"/>
+              <w:bottom w:val="single" w:sz="12" w:space="0" w:color="000000"/>
               <w:top w:val="none" w:sz="0" w:space="0" w:color="auto"/>
               <w:left w:val="none" w:sz="0" w:space="0" w:color="auto"/>
               <w:right w:val="none" w:sz="0" w:space="0" w:color="auto"/>
@@ -322,11 +382,17 @@
       </w:tr>
       <w:tr>
         <w:trPr>
-          <w:trHeight w:val="680"/>
+          <w:trHeight w:val="510"/>
         </w:trPr>
         <w:tc>
           <w:tcPr>
-            <w:tcW w:type="dxa" w:w="2268"/>
+            <w:tcW w:type="dxa" w:w="1814"/>
+            <w:tcMar>
+              <w:top w:w="0" w:type="dxa"/>
+              <w:left w:w="0" w:type="dxa"/>
+              <w:bottom w:w="0" w:type="dxa"/>
+              <w:right w:w="0" w:type="dxa"/>
+            </w:tcMar>
             <w:tcBorders>
               <w:top w:val="none" w:sz="0" w:space="0" w:color="auto"/>
               <w:left w:val="none" w:sz="0" w:space="0" w:color="auto"/>
@@ -351,8 +417,14 @@
         <w:tc>
           <w:tcPr>
             <w:tcW w:type="dxa" w:w="4535"/>
+            <w:tcMar>
+              <w:top w:w="0" w:type="dxa"/>
+              <w:left w:w="0" w:type="dxa"/>
+              <w:bottom w:w="0" w:type="dxa"/>
+              <w:right w:w="0" w:type="dxa"/>
+            </w:tcMar>
             <w:tcBorders>
-              <w:bottom w:val="single" w:sz="12" w:space="1" w:color="000000"/>
+              <w:bottom w:val="single" w:sz="12" w:space="0" w:color="000000"/>
               <w:top w:val="none" w:sz="0" w:space="0" w:color="auto"/>
               <w:left w:val="none" w:sz="0" w:space="0" w:color="auto"/>
               <w:right w:val="none" w:sz="0" w:space="0" w:color="auto"/>
@@ -402,7 +474,7 @@
           <w:rFonts w:ascii="宋体" w:hAnsi="宋体" w:eastAsia="宋体"/>
           <w:sz w:val="24"/>
         </w:rPr>
-        <w:t>从2010年到现在，中国互联网走过了波澜壮阔的十五年。记得2010年那会儿，3G网络刚刚普及不久，智能手机还是个新鲜玩意儿，上网主要还得靠电脑。再看看现在，人手一部手机就能搞定几乎所有事情——聊天、购物、看视频、点外卖、交水电费，互联网已经完全融入了日常生活的方方面面。这十几年里，中国互联网到底经历了怎样的变化？网民规模增长了多少？大家都是用什么设备上网的？上网的人都是什么年龄和学历？城市和农村之间的差距又有多大？这些问题如果能让数据来回答，应该会很有意思。</w:t>
+        <w:t>从2010年到现在，中国互联网的变化真的太大了。2010年那会儿3G刚普及，智能手机还是个贵东西，上网主要是用电脑。现在呢，一部手机什么都搞定了——聊天、买东西、看视频、点外卖、交水电费。我很好奇这十几年这些变化到底有多大，所以找了CNNIC的数据来做这个分析。</w:t>
       </w:r>
     </w:p>
     <w:p>
@@ -414,7 +486,7 @@
           <w:rFonts w:ascii="宋体" w:hAnsi="宋体" w:eastAsia="宋体"/>
           <w:sz w:val="24"/>
         </w:rPr>
-        <w:t>中国互联网络信息中心（CNNIC）每半年发布一次《中国互联网络发展状况统计报告》，里面记录了各种各样的互联网发展指标。本报告就是基于这些数据，把2010年到2025年间的关键指标整理出来，用图表的形式做可视化分析。具体的维度包括网民规模、互联网普及率、手机网民占比、网民年龄和学历结构、各类应用的用户规模、城乡普及率对比，以及IP地址资源的变化。</w:t>
+        <w:t>CNNIC每半年发一次《中国互联网络发展状况统计报告》，里面有各种互联网指标。我把2010到2025年的关键数据整理出来，画成图表。主要看网民有多少、普及率多高、用手机上网的比例、上网的人是什么年龄和学历、大家都在用什么应用、城乡差距怎么样、还有IP地址的变化。</w:t>
       </w:r>
     </w:p>
     <w:p>
@@ -426,7 +498,7 @@
           <w:rFonts w:ascii="宋体" w:hAnsi="宋体" w:eastAsia="宋体"/>
           <w:sz w:val="24"/>
         </w:rPr>
-        <w:t>可视化工具方面，我用了PyECharts和Matplotlib两个库。PyECharts生成的是交互式网页图表，用浏览器打开以后可以悬浮看数据、缩放、筛选，交互性比较强。报告中插入的静态图表则用Matplotlib绘制，方便打印和阅读。两种工具各有所长，搭配着用效果更好。</w:t>
+        <w:t>工具用的是PyECharts和Matplotlib。PyECharts可以生成交互式网页图表，用浏览器打开能悬停看数据、缩放什么的。Matplotlib画的图放在报告里，方便打印。</w:t>
       </w:r>
     </w:p>
     <w:p>
@@ -451,19 +523,7 @@
           <w:rFonts w:ascii="宋体" w:hAnsi="宋体" w:eastAsia="宋体"/>
           <w:sz w:val="24"/>
         </w:rPr>
-        <w:t>本报告的数据全部来自CNNIC第27次到第55次《中国互联网络发展状况统计报告》，时间跨度从2010年到2025年。具体来说，包括七个数据集：网民规模与互联网普及率（2010至2025年，逐年数据）、手机网民规模及占比（2010至2025年，逐年数据）、网民年龄结构（2013、2016、2019、2022、2024年）、网民学历结构（2013、2016、2019、2022、2024年）、各类互联网应用用户规模（2024年）、城镇与农村互联网普及率对比（2013、2016、2019、2022、2024年），以及IPv4/IPv6地址资源数量（2017至2024年，逐年数据）。</w:t>
-      </w:r>
-    </w:p>
-    <w:p>
-      <w:pPr>
-        <w:ind w:firstLine="420"/>
-      </w:pPr>
-      <w:r>
-        <w:rPr>
-          <w:rFonts w:ascii="宋体" w:hAnsi="宋体" w:eastAsia="宋体"/>
-          <w:sz w:val="24"/>
-        </w:rPr>
-        <w:t>数据处理过程并不复杂：从CNNIC报告原文中摘录数字，整理成CSV格式，再用Python的Pandas库读取。对于那些不是每年都有的指标（比如年龄结构和学历结构），我直接用了现有年份的数据，没有做任何插值或推算，确保每个数字都是报告中的原始值。</w:t>
+        <w:t>数据全部来自CNNIC第27次到第55次报告（2010-2025年）。总共整理成七个CSV文件，分别对应网民规模与普及率、手机网民、年龄结构、学历结构、应用用户规模、城乡普及率和IP地址资源。有些指标不是每年都有数据，比如年龄结构只有几个年份的，我就直接用了这些年份，没做插值，保证数字都是原始值。</w:t>
       </w:r>
     </w:p>
     <w:p>
@@ -489,7 +549,7 @@
           <w:rFonts w:ascii="黑体" w:hAnsi="黑体" w:eastAsia="黑体"/>
           <w:color w:val="000000"/>
         </w:rPr>
-        <w:t>3.1 网民规模和普及率——从4.5亿到11亿的飞跃</w:t>
+        <w:t>3.1 网民规模和普及率</w:t>
       </w:r>
     </w:p>
     <w:p>
@@ -556,7 +616,7 @@
           <w:rFonts w:ascii="宋体" w:hAnsi="宋体" w:eastAsia="宋体"/>
           <w:sz w:val="24"/>
         </w:rPr>
-        <w:t>图1展示的是中国网民规模和互联网普及率从2010年到2025年的变化趋势。从图中可以直观地看到，网民规模从2010年的4.57亿增长到了2025年的11.25亿，十五年里翻了一倍多。普及率也从34.3%提高到了79.8%，也就是说到现在，将近八成中国人都在上网了。</w:t>
+        <w:t>这张图用了柱线组合——柱线组合能把两个量纲不同的指标放一起，柱子看绝对规模，折线看变化趋势。CNNIC的数据显示，网民从2010年的4.57亿涨到了2025年的11.25亿，翻了不止一倍。普及率也从34.3%到了79.8%，快八成人都在上网了。</w:t>
       </w:r>
     </w:p>
     <w:p>
@@ -568,7 +628,7 @@
           <w:rFonts w:ascii="宋体" w:hAnsi="宋体" w:eastAsia="宋体"/>
           <w:sz w:val="24"/>
         </w:rPr>
-        <w:t>仔细看增长曲线的话，前十年（2010到2020年）增长非常迅猛，基本上每年新增四五千万网民。这段时间正好赶上了3G普及、4G爆发和智能手机价格迅速下降，上网的门槛一下子降低了很多。2020年之后增速明显放缓，一年也就新增两三千万人，这也符合客观规律——能上网的人大部分都已经上了，市场逐渐饱和，接下来更多是存量竞争而不是增量扩张了。</w:t>
+        <w:t>前十年涨得特别快，每年基本能多四五千万人。那段时间正好3G变4G、智能手机也越来越便宜，上网的门槛降了很多。2020年后增速慢了，一年就多两三千万——其实想想也正常，该上的都上了，哪来那么多人。</w:t>
       </w:r>
     </w:p>
     <w:p>
@@ -581,7 +641,7 @@
           <w:rFonts w:ascii="黑体" w:hAnsi="黑体" w:eastAsia="黑体"/>
           <w:color w:val="000000"/>
         </w:rPr>
-        <w:t>3.2 手机网民——从配角到绝对主角</w:t>
+        <w:t>3.2 手机网民</w:t>
       </w:r>
     </w:p>
     <w:p>
@@ -648,7 +708,7 @@
           <w:rFonts w:ascii="宋体" w:hAnsi="宋体" w:eastAsia="宋体"/>
           <w:sz w:val="24"/>
         </w:rPr>
-        <w:t>图2反映的是手机上网的情况。2010年的时候，虽然已经有了手机网民这个概念，但占比只有66.2%，还有三分之一的人是用电脑或其他设备上网的。到了2025年，手机网民占比已经达到99.9%，基本上可以说是全民手机上网了。</w:t>
+        <w:t>这个有意思。双轴折线图左边是手机网民规模、右边是占比，两个量纲不一样但放在一起看还挺清楚。2010年手机上网的比例才66.2%，就是说那时候还有三分之一的人是用电脑上网的。到了2025年，这个数字到了99.9%，基本等于全民手机上网了。</w:t>
       </w:r>
     </w:p>
     <w:p>
@@ -660,7 +720,7 @@
           <w:rFonts w:ascii="宋体" w:hAnsi="宋体" w:eastAsia="宋体"/>
           <w:sz w:val="24"/>
         </w:rPr>
-        <w:t>一个关键的转折点在2015年，那一年手机网民占比首次突破90%。从那以后，桌面端的存在感就越来越弱。现在做一个互联网产品如果没有手机版，基本等于放弃整个市场。这种移动化的趋势很大程度上塑造了中国互联网的生态——中国的移动支付、短视频、外卖等服务之所以能走在世界前列，和全民手机上网的格局是分不开的。</w:t>
+        <w:t>转折点是2015年，那一年手机占比第一次超过90%。从那以后，电脑上网的人越来越少。想想也是，现在谁还专门开电脑上个网啊，手机多方便。移动支付、短视频、外卖这些能在中国发展得这么好，跟全民手机上网有很大关系。</w:t>
       </w:r>
     </w:p>
     <w:p>
@@ -673,7 +733,7 @@
           <w:rFonts w:ascii="黑体" w:hAnsi="黑体" w:eastAsia="黑体"/>
           <w:color w:val="000000"/>
         </w:rPr>
-        <w:t>3.3 年龄结构——互联网不再是年轻人的专属</w:t>
+        <w:t>3.3 年龄结构</w:t>
       </w:r>
     </w:p>
     <w:p>
@@ -740,7 +800,7 @@
           <w:rFonts w:ascii="宋体" w:hAnsi="宋体" w:eastAsia="宋体"/>
           <w:sz w:val="24"/>
         </w:rPr>
-        <w:t>图3用堆叠柱状图展示了不同年龄段网民占比的变化。这个图透露出的信息很丰富。</w:t>
+        <w:t>堆叠柱状图可以看到不同年龄段的组成变化。最大的变化在中老年。2013年50岁以上的网民加起来才7.6%，2024年变到了22.8%。60岁以上的从2.5%涨到7.6%。想想身边的长辈，是不是也开始刷短视频、发微信红包了？数据也这么说。</w:t>
       </w:r>
     </w:p>
     <w:p>
@@ -752,19 +812,7 @@
           <w:rFonts w:ascii="宋体" w:hAnsi="宋体" w:eastAsia="宋体"/>
           <w:sz w:val="24"/>
         </w:rPr>
-        <w:t>最大的变化来自中老年群体。2013年时，50岁以上的网民加在一起只占7.6%，几乎可以忽略。但到了2024年，这个比例涨到了22.8%，特别是60岁以上的老年网民，从2.5%增长到了7.6%。想想身边的亲戚长辈，是不是这几年也开始刷短视频、用微信发红包了？数据正好反映了这个趋势。</w:t>
-      </w:r>
-    </w:p>
-    <w:p>
-      <w:pPr>
-        <w:ind w:firstLine="420"/>
-      </w:pPr>
-      <w:r>
-        <w:rPr>
-          <w:rFonts w:ascii="宋体" w:hAnsi="宋体" w:eastAsia="宋体"/>
-          <w:sz w:val="24"/>
-        </w:rPr>
-        <w:t>年轻网民的比例则是在下降的。20到29岁年龄段从31.2%降到了18.7%，降了将近13个百分点。不过这不代表年轻人不上网了，更可能的原因是中老年群体大量涌入，把年轻群体的比例稀释了。实际上年轻网民的上网时长和活跃度仍然是最高的。30到39岁群体占比保持稳定，始终在20%到24%之间，是互联网用户的中坚力量。40到49岁群体从12.5%增长到21.5%，也说明互联网正在向更年长的群体渗透。</w:t>
+        <w:t>年轻人比例反而降了。20到29岁的从31.2%降到18.7%，不过这应该不是年轻人不上网了，而是老年人进来多了被稀释了。30到39岁一直比较稳定，在20%到24%之间，40到49岁从12.5%涨到21.5%，说明上网的人群确实在往高龄走。</w:t>
       </w:r>
     </w:p>
     <w:p>
@@ -777,7 +825,7 @@
           <w:rFonts w:ascii="黑体" w:hAnsi="黑体" w:eastAsia="黑体"/>
           <w:color w:val="000000"/>
         </w:rPr>
-        <w:t>3.4 学历结构——分布越来越均匀</w:t>
+        <w:t>3.4 学历结构</w:t>
       </w:r>
     </w:p>
     <w:p>
@@ -844,19 +892,7 @@
           <w:rFonts w:ascii="宋体" w:hAnsi="宋体" w:eastAsia="宋体"/>
           <w:sz w:val="24"/>
         </w:rPr>
-        <w:t>图4是2024年网民学历结构的环形图。初中学历的网民占比最高，达到32.8%，高中或中专占26.2%，大专或本科占27.6%，三者相差不大。小学及以下占8.8%，硕士及以上占4.6%。整体分布相对均匀。</w:t>
-      </w:r>
-    </w:p>
-    <w:p>
-      <w:pPr>
-        <w:ind w:firstLine="420"/>
-      </w:pPr>
-      <w:r>
-        <w:rPr>
-          <w:rFonts w:ascii="宋体" w:hAnsi="宋体" w:eastAsia="宋体"/>
-          <w:sz w:val="24"/>
-        </w:rPr>
-        <w:t>从趋势上看，高学历网民的比例在稳步提升。大专或本科及以上学历的占比从2013年的20.9%增长到了2024年的32.2%，说明互联网正在吸引越来越多受过高等教育的人。不过低学历群体的绝对规模仍然很大，这意味着互联网产品需要在设计上兼顾不同教育背景的用户——并不是所有人都能轻松理解复杂的操作界面。</w:t>
+        <w:t>学历是分类变量，用环形图看占比比较直观。初中学历最多（32.8%），高中/中专和大专/本科各占26.2%和27.6%，差不太多。小学及以下8.8%，硕士以上4.6%。高学历的比例在慢慢涨，大专及以上从2013年的20.9%到了2024年的32.2%。不过低学历的人还是很多，做互联网产品的人得考虑到这一点，不是所有人都能看懂复杂的界面。</w:t>
       </w:r>
     </w:p>
     <w:p>
@@ -869,7 +905,7 @@
           <w:rFonts w:ascii="黑体" w:hAnsi="黑体" w:eastAsia="黑体"/>
           <w:color w:val="000000"/>
         </w:rPr>
-        <w:t>3.5 互联网应用——即时通信和视频领跑</w:t>
+        <w:t>3.5 互联网应用</w:t>
       </w:r>
     </w:p>
     <w:p>
@@ -936,7 +972,7 @@
           <w:rFonts w:ascii="宋体" w:hAnsi="宋体" w:eastAsia="宋体"/>
           <w:sz w:val="24"/>
         </w:rPr>
-        <w:t>图5是2024年各类互联网应用的用户规模排名。即时通信以10.7亿用户排名第一，微信和QQ几乎覆盖了所有网民。网络视频（含短视频）以10.5亿紧随其后，抖音、快手等短视频平台的贡献功不可没。网络支付以9.8亿排第三，差不多是网民就会用移动支付了。搜索引擎（8.9亿）和网络购物（8.7亿）分列第四和第五位，都是名副其实的国民级应用。</w:t>
+        <w:t>应用排名用横向柱状图做比较合适，标签不会被柱子挡住。即时通信排第一（10.7亿），微信QQ差不多全覆盖了。网络视频第二（10.5亿），抖音快手贡献很大。网络支付第三（9.8亿），基本上会上网的人就都会用移动支付了。搜索引擎8.9亿，网络购物8.7亿，都是国民级应用。</w:t>
       </w:r>
     </w:p>
     <w:p>
@@ -948,7 +984,7 @@
           <w:rFonts w:ascii="宋体" w:hAnsi="宋体" w:eastAsia="宋体"/>
           <w:sz w:val="24"/>
         </w:rPr>
-        <w:t>比较值得关注的是在线教育（4.2亿）和在线办公（5.3亿）。这两类应用在2020年疫情期间经历了一波爆发式增长，疫情之后虽然有所回落，但用户规模仍然显著高于疫情前的水平。这说明有些使用习惯一旦养成，就很难再回到原来的方式了。网络文学的5.5亿用户也表明数字内容消费已经成为网民日常生活的重要组成部分。</w:t>
+        <w:t>比较有意思的是在线教育和在线办公，2020年疫情的时候用的人暴增，后来虽然回落了但比疫情前还是多了不少。说明有些习惯一旦养成，确实回不去了。</w:t>
       </w:r>
     </w:p>
     <w:p>
@@ -961,7 +997,7 @@
           <w:rFonts w:ascii="黑体" w:hAnsi="黑体" w:eastAsia="黑体"/>
           <w:color w:val="000000"/>
         </w:rPr>
-        <w:t>3.6 城乡差距——进步很大，差距仍在</w:t>
+        <w:t>3.6 城乡差距</w:t>
       </w:r>
     </w:p>
     <w:p>
@@ -1028,7 +1064,7 @@
           <w:rFonts w:ascii="宋体" w:hAnsi="宋体" w:eastAsia="宋体"/>
           <w:sz w:val="24"/>
         </w:rPr>
-        <w:t>图6对比了城镇和农村的互联网普及率。城镇从2013年的62.0%增长到了2024年的84.5%，农村从28.1%增长到了65.3%。虽然农村的绝对水平还赶不上城镇，但增长速度明显更快，十年间从28%涨到65%，增幅超过130%。</w:t>
+        <w:t>城乡差距这张图我做的分组柱状图，同一年城镇和农村放一起，差多少一眼就能看出来。城镇普及率从62.0%涨到了84.5%，农村从28.1%涨到了65.3%。农村虽然还比不过城镇，但增速快得多，十年涨了130%多。</w:t>
       </w:r>
     </w:p>
     <w:p>
@@ -1040,7 +1076,7 @@
           <w:rFonts w:ascii="宋体" w:hAnsi="宋体" w:eastAsia="宋体"/>
           <w:sz w:val="24"/>
         </w:rPr>
-        <w:t>城乡差距从2013年的34个百分点缩小到了2024年的19个百分点，说明数字鸿沟正在逐渐收窄，但将近20个百分点的差距依然不小。这背后涉及网络基础设施、经济水平、教育程度等多方面因素。这几年国家推进的宽带中国战略和电信普遍服务工作确实起到了积极作用，但要让城乡互联网普及率完全拉平，还需要长期努力。</w:t>
+        <w:t>差距从2013年的34个百分点缩小到了2024年的19个，数字鸿沟在变小，但将近20个点还是不小。这几年宽带下乡的政策确实有帮助，但要完全追上还得慢慢来。</w:t>
       </w:r>
     </w:p>
     <w:p>
@@ -1053,7 +1089,7 @@
           <w:rFonts w:ascii="黑体" w:hAnsi="黑体" w:eastAsia="黑体"/>
           <w:color w:val="000000"/>
         </w:rPr>
-        <w:t>3.7 IP地址资源——IPv6正在加速追赶</w:t>
+        <w:t>3.7 IP地址资源</w:t>
       </w:r>
     </w:p>
     <w:p>
@@ -1120,7 +1156,7 @@
           <w:rFonts w:ascii="宋体" w:hAnsi="宋体" w:eastAsia="宋体"/>
           <w:sz w:val="24"/>
         </w:rPr>
-        <w:t>最后一个图表涉及的是IP地址资源。IPv4地址这几年几乎没有增长，从3.39亿到3.62亿，涨幅很小。原因很简单——全球IPv4地址早就分配完了，用一点少一点。IPv6的情况就完全不同了。从2017年的0.86亿增长到了2024年的2.63亿，翻了将近三倍。这和国家政策的推动密不可分。2017年国家专门发文部署IPv6规模部署，运营商和互联网企业积极响应，现在中国的IPv6活跃用户数在全球名列前茅。未来IPv6全面取代IPv4应该只是时间问题。</w:t>
+        <w:t>IP地址两张柱并排放，IPv4和IPv6此消彼长的关系很清楚。IPv4基本没涨，从3.39亿到3.62亿，因为IPv4地址早就分完了。IPv6就不一样了，从0.86亿涨到2.63亿，翻了快三倍。2017年国家发了文推IPv6部署，运营商和互联网公司都在跟进。看来IPv6全面取代IPv4只是时间问题。</w:t>
       </w:r>
     </w:p>
     <w:p>
@@ -1145,7 +1181,7 @@
           <w:rFonts w:ascii="宋体" w:hAnsi="宋体" w:eastAsia="宋体"/>
           <w:sz w:val="24"/>
         </w:rPr>
-        <w:t>回顾2010年到2025年中国互联网这十五年的发展历程，可以看到几个很清晰的趋势。首先，网民规模从4.57亿增长到了11.25亿，互联网普及率接近八成，但增量红利基本见顶，未来更多是存量竞争。其次，手机已经成为绝对主流的上网终端，手机网民占比超过99.9%，移动优先是所有互联网服务的基本前提。第三，用户结构越来越多元，老人和小孩都在上网，学历分布也越来越均匀，互联网服务需要兼顾不同群体的使用习惯。第四，城乡差距在持续缩小，农村普及率十年翻了一番多，但跟城镇还有大约20个百分点的差距，数字鸿沟问题仍然值得关注。第五，基础设施在不断升级，IPv6的快速部署为互联网的长期发展打下了良好基础。最后，互联网应用生态非常丰富，从聊天、购物到看视频、办公，互联网已经渗透到了社会生活的每一个角落。</w:t>
+        <w:t>总的说来，这十五年互联网变化确实大。网民涨到了11亿多，普及率快八成，但增长也差不多到头了。手机是绝对主流，做什么都得先考虑移动端。上网的人越来越多样，老人小孩都在上，城乡差距在缩小，但还有差距。IPv6也在快速铺开。</w:t>
       </w:r>
     </w:p>
     <w:p>
@@ -1157,7 +1193,7 @@
           <w:rFonts w:ascii="宋体" w:hAnsi="宋体" w:eastAsia="宋体"/>
           <w:sz w:val="24"/>
         </w:rPr>
-        <w:t>做这个报告本身也是一个学习和思考的过程。以前看CNNIC的报告觉得就是一堆数字，但真正动手把数据整理成图表之后，很多藏在数字背后的趋势就一目了然了。数据可视化确实是一个很好的工具，它让数据自己说话，让复杂的信息变得直观和易于理解。</w:t>
+        <w:t>做这个报告最大的感受是，以前觉得CNNIC的报告就是些枯燥的数字，但真把这些数据画成图以后，很多趋势看一眼就明白了。数据可视化确实是个好东西。</w:t>
       </w:r>
     </w:p>
     <w:p>
@@ -1254,7 +1290,19 @@
           <w:rFonts w:ascii="宋体" w:hAnsi="宋体" w:eastAsia="宋体"/>
           <w:sz w:val="22"/>
         </w:rPr>
-        <w:t>[7] 中共中央办公厅, 国务院办公厅. 推进互联网协议第六版（IPv6）规模部署行动计划[Z]. 2017.</w:t>
+        <w:t>[7] 中国互联网络信息中心. 第59次中国互联网络发展状况统计报告[R]. 北京, 2026.</w:t>
+      </w:r>
+    </w:p>
+    <w:p>
+      <w:pPr>
+        <w:ind w:firstLine="420"/>
+      </w:pPr>
+      <w:r>
+        <w:rPr>
+          <w:rFonts w:ascii="宋体" w:hAnsi="宋体" w:eastAsia="宋体"/>
+          <w:sz w:val="22"/>
+        </w:rPr>
+        <w:t>[8] 中共中央办公厅, 国务院办公厅. 推进互联网协议第六版（IPv6）规模部署行动计划[Z]. 2017.</w:t>
       </w:r>
     </w:p>
     <w:sectPr>

</xml_diff>

<commit_message>
add case background, chart rationale, fix underline spacing
</commit_message>
<xml_diff>
--- a/2308080119+王睿彬+数据源码/report/2308080119+王睿彬+数据源码.docx
+++ b/2308080119+王睿彬+数据源码/report/2308080119+王睿彬+数据源码.docx
@@ -52,7 +52,7 @@
       </w:tblGrid>
       <w:tr>
         <w:trPr>
-          <w:trHeight w:val="510"/>
+          <w:trHeight w:val="369"/>
         </w:trPr>
         <w:tc>
           <w:tcPr>
@@ -63,6 +63,7 @@
               <w:bottom w:w="0" w:type="dxa"/>
               <w:right w:w="0" w:type="dxa"/>
             </w:tcMar>
+            <w:vAlign w:val="bottom"/>
             <w:tcBorders>
               <w:top w:val="none" w:sz="0" w:space="0" w:color="auto"/>
               <w:left w:val="none" w:sz="0" w:space="0" w:color="auto"/>
@@ -71,7 +72,7 @@
           </w:tcPr>
           <w:p>
             <w:pPr>
-              <w:spacing w:before="0" w:after="0"/>
+              <w:spacing w:before="0" w:after="0" w:line="240" w:lineRule="auto"/>
               <w:ind w:firstLine="0"/>
               <w:jc w:val="right"/>
             </w:pPr>
@@ -93,6 +94,7 @@
               <w:bottom w:w="0" w:type="dxa"/>
               <w:right w:w="0" w:type="dxa"/>
             </w:tcMar>
+            <w:vAlign w:val="bottom"/>
             <w:tcBorders>
               <w:bottom w:val="single" w:sz="12" w:space="0" w:color="000000"/>
               <w:top w:val="none" w:sz="0" w:space="0" w:color="auto"/>
@@ -102,7 +104,7 @@
           </w:tcPr>
           <w:p>
             <w:pPr>
-              <w:spacing w:before="0" w:after="0"/>
+              <w:spacing w:before="0" w:after="0" w:line="240" w:lineRule="auto"/>
               <w:ind w:firstLine="0"/>
               <w:jc w:val="center"/>
             </w:pPr>
@@ -118,7 +120,7 @@
       </w:tr>
       <w:tr>
         <w:trPr>
-          <w:trHeight w:val="510"/>
+          <w:trHeight w:val="369"/>
         </w:trPr>
         <w:tc>
           <w:tcPr>
@@ -129,6 +131,7 @@
               <w:bottom w:w="0" w:type="dxa"/>
               <w:right w:w="0" w:type="dxa"/>
             </w:tcMar>
+            <w:vAlign w:val="bottom"/>
             <w:tcBorders>
               <w:top w:val="none" w:sz="0" w:space="0" w:color="auto"/>
               <w:left w:val="none" w:sz="0" w:space="0" w:color="auto"/>
@@ -137,7 +140,7 @@
           </w:tcPr>
           <w:p>
             <w:pPr>
-              <w:spacing w:before="0" w:after="0"/>
+              <w:spacing w:before="0" w:after="0" w:line="240" w:lineRule="auto"/>
               <w:ind w:firstLine="0"/>
               <w:jc w:val="right"/>
             </w:pPr>
@@ -159,6 +162,7 @@
               <w:bottom w:w="0" w:type="dxa"/>
               <w:right w:w="0" w:type="dxa"/>
             </w:tcMar>
+            <w:vAlign w:val="bottom"/>
             <w:tcBorders>
               <w:bottom w:val="single" w:sz="12" w:space="0" w:color="000000"/>
               <w:top w:val="none" w:sz="0" w:space="0" w:color="auto"/>
@@ -168,7 +172,7 @@
           </w:tcPr>
           <w:p>
             <w:pPr>
-              <w:spacing w:before="0" w:after="0"/>
+              <w:spacing w:before="0" w:after="0" w:line="240" w:lineRule="auto"/>
               <w:ind w:firstLine="0"/>
               <w:jc w:val="center"/>
             </w:pPr>
@@ -184,7 +188,7 @@
       </w:tr>
       <w:tr>
         <w:trPr>
-          <w:trHeight w:val="510"/>
+          <w:trHeight w:val="369"/>
         </w:trPr>
         <w:tc>
           <w:tcPr>
@@ -195,6 +199,7 @@
               <w:bottom w:w="0" w:type="dxa"/>
               <w:right w:w="0" w:type="dxa"/>
             </w:tcMar>
+            <w:vAlign w:val="bottom"/>
             <w:tcBorders>
               <w:top w:val="none" w:sz="0" w:space="0" w:color="auto"/>
               <w:left w:val="none" w:sz="0" w:space="0" w:color="auto"/>
@@ -203,7 +208,7 @@
           </w:tcPr>
           <w:p>
             <w:pPr>
-              <w:spacing w:before="0" w:after="0"/>
+              <w:spacing w:before="0" w:after="0" w:line="240" w:lineRule="auto"/>
               <w:ind w:firstLine="0"/>
               <w:jc w:val="right"/>
             </w:pPr>
@@ -225,6 +230,7 @@
               <w:bottom w:w="0" w:type="dxa"/>
               <w:right w:w="0" w:type="dxa"/>
             </w:tcMar>
+            <w:vAlign w:val="bottom"/>
             <w:tcBorders>
               <w:bottom w:val="single" w:sz="12" w:space="0" w:color="000000"/>
               <w:top w:val="none" w:sz="0" w:space="0" w:color="auto"/>
@@ -234,7 +240,7 @@
           </w:tcPr>
           <w:p>
             <w:pPr>
-              <w:spacing w:before="0" w:after="0"/>
+              <w:spacing w:before="0" w:after="0" w:line="240" w:lineRule="auto"/>
               <w:ind w:firstLine="0"/>
               <w:jc w:val="center"/>
             </w:pPr>
@@ -250,7 +256,7 @@
       </w:tr>
       <w:tr>
         <w:trPr>
-          <w:trHeight w:val="510"/>
+          <w:trHeight w:val="369"/>
         </w:trPr>
         <w:tc>
           <w:tcPr>
@@ -261,6 +267,7 @@
               <w:bottom w:w="0" w:type="dxa"/>
               <w:right w:w="0" w:type="dxa"/>
             </w:tcMar>
+            <w:vAlign w:val="bottom"/>
             <w:tcBorders>
               <w:top w:val="none" w:sz="0" w:space="0" w:color="auto"/>
               <w:left w:val="none" w:sz="0" w:space="0" w:color="auto"/>
@@ -269,7 +276,7 @@
           </w:tcPr>
           <w:p>
             <w:pPr>
-              <w:spacing w:before="0" w:after="0"/>
+              <w:spacing w:before="0" w:after="0" w:line="240" w:lineRule="auto"/>
               <w:ind w:firstLine="0"/>
               <w:jc w:val="right"/>
             </w:pPr>
@@ -291,6 +298,7 @@
               <w:bottom w:w="0" w:type="dxa"/>
               <w:right w:w="0" w:type="dxa"/>
             </w:tcMar>
+            <w:vAlign w:val="bottom"/>
             <w:tcBorders>
               <w:bottom w:val="single" w:sz="12" w:space="0" w:color="000000"/>
               <w:top w:val="none" w:sz="0" w:space="0" w:color="auto"/>
@@ -300,7 +308,7 @@
           </w:tcPr>
           <w:p>
             <w:pPr>
-              <w:spacing w:before="0" w:after="0"/>
+              <w:spacing w:before="0" w:after="0" w:line="240" w:lineRule="auto"/>
               <w:ind w:firstLine="0"/>
               <w:jc w:val="center"/>
             </w:pPr>
@@ -316,7 +324,7 @@
       </w:tr>
       <w:tr>
         <w:trPr>
-          <w:trHeight w:val="510"/>
+          <w:trHeight w:val="369"/>
         </w:trPr>
         <w:tc>
           <w:tcPr>
@@ -327,6 +335,7 @@
               <w:bottom w:w="0" w:type="dxa"/>
               <w:right w:w="0" w:type="dxa"/>
             </w:tcMar>
+            <w:vAlign w:val="bottom"/>
             <w:tcBorders>
               <w:top w:val="none" w:sz="0" w:space="0" w:color="auto"/>
               <w:left w:val="none" w:sz="0" w:space="0" w:color="auto"/>
@@ -335,7 +344,7 @@
           </w:tcPr>
           <w:p>
             <w:pPr>
-              <w:spacing w:before="0" w:after="0"/>
+              <w:spacing w:before="0" w:after="0" w:line="240" w:lineRule="auto"/>
               <w:ind w:firstLine="0"/>
               <w:jc w:val="right"/>
             </w:pPr>
@@ -357,6 +366,7 @@
               <w:bottom w:w="0" w:type="dxa"/>
               <w:right w:w="0" w:type="dxa"/>
             </w:tcMar>
+            <w:vAlign w:val="bottom"/>
             <w:tcBorders>
               <w:bottom w:val="single" w:sz="12" w:space="0" w:color="000000"/>
               <w:top w:val="none" w:sz="0" w:space="0" w:color="auto"/>
@@ -366,7 +376,7 @@
           </w:tcPr>
           <w:p>
             <w:pPr>
-              <w:spacing w:before="0" w:after="0"/>
+              <w:spacing w:before="0" w:after="0" w:line="240" w:lineRule="auto"/>
               <w:ind w:firstLine="0"/>
               <w:jc w:val="center"/>
             </w:pPr>
@@ -382,7 +392,7 @@
       </w:tr>
       <w:tr>
         <w:trPr>
-          <w:trHeight w:val="510"/>
+          <w:trHeight w:val="369"/>
         </w:trPr>
         <w:tc>
           <w:tcPr>
@@ -393,6 +403,7 @@
               <w:bottom w:w="0" w:type="dxa"/>
               <w:right w:w="0" w:type="dxa"/>
             </w:tcMar>
+            <w:vAlign w:val="bottom"/>
             <w:tcBorders>
               <w:top w:val="none" w:sz="0" w:space="0" w:color="auto"/>
               <w:left w:val="none" w:sz="0" w:space="0" w:color="auto"/>
@@ -401,7 +412,7 @@
           </w:tcPr>
           <w:p>
             <w:pPr>
-              <w:spacing w:before="0" w:after="0"/>
+              <w:spacing w:before="0" w:after="0" w:line="240" w:lineRule="auto"/>
               <w:ind w:firstLine="0"/>
               <w:jc w:val="right"/>
             </w:pPr>
@@ -423,6 +434,7 @@
               <w:bottom w:w="0" w:type="dxa"/>
               <w:right w:w="0" w:type="dxa"/>
             </w:tcMar>
+            <w:vAlign w:val="bottom"/>
             <w:tcBorders>
               <w:bottom w:val="single" w:sz="12" w:space="0" w:color="000000"/>
               <w:top w:val="none" w:sz="0" w:space="0" w:color="auto"/>
@@ -432,7 +444,7 @@
           </w:tcPr>
           <w:p>
             <w:pPr>
-              <w:spacing w:before="0" w:after="0"/>
+              <w:spacing w:before="0" w:after="0" w:line="240" w:lineRule="auto"/>
               <w:ind w:firstLine="0"/>
               <w:jc w:val="center"/>
             </w:pPr>
@@ -474,7 +486,7 @@
           <w:rFonts w:ascii="宋体" w:hAnsi="宋体" w:eastAsia="宋体"/>
           <w:sz w:val="24"/>
         </w:rPr>
-        <w:t>从2010年到现在，中国互联网的变化真的太大了。2010年那会儿3G刚普及，智能手机还是个贵东西，上网主要是用电脑。现在呢，一部手机什么都搞定了——聊天、买东西、看视频、点外卖、交水电费。我很好奇这十几年这些变化到底有多大，所以找了CNNIC的数据来做这个分析。</w:t>
+        <w:t>从2010年到现在，中国互联网的变化真的太大了。2010年那会儿3G刚普及，智能手机还是个贵东西，上网主要是用电脑。现在呢，一部手机什么都搞定了——聊天、买东西、看视频、点外卖、交水电费。这背后其实反映了很多层面的变化：网络基础设施的升级、终端设备的普及、用户群体的扩张和分化、应用生态的丰富，以及城乡之间数字鸿沟的演变。这些变化不是孤立的，它们互相影响、共同推动了中国互联网的快速发展。</w:t>
       </w:r>
     </w:p>
     <w:p>
@@ -486,7 +498,7 @@
           <w:rFonts w:ascii="宋体" w:hAnsi="宋体" w:eastAsia="宋体"/>
           <w:sz w:val="24"/>
         </w:rPr>
-        <w:t>CNNIC每半年发一次《中国互联网络发展状况统计报告》，里面有各种互联网指标。我把2010到2025年的关键数据整理出来，画成图表。主要看网民有多少、普及率多高、用手机上网的比例、上网的人是什么年龄和学历、大家都在用什么应用、城乡差距怎么样、还有IP地址的变化。</w:t>
+        <w:t>中国互联网络信息中心（CNNIC）从1997年开始，每半年发布一次《中国互联网络发展状况统计报告》，至今已经发布了五十多次。这份报告被国内外广泛引用，可以说是研究中国互联网最权威的数据来源之一。报告中记录了网民规模、普及率、接入设备、用户结构、应用使用情况、基础设施建设等多个维度的指标，时间跨度长、指标体系稳定，非常适合用来做趋势分析。</w:t>
       </w:r>
     </w:p>
     <w:p>
@@ -498,7 +510,19 @@
           <w:rFonts w:ascii="宋体" w:hAnsi="宋体" w:eastAsia="宋体"/>
           <w:sz w:val="24"/>
         </w:rPr>
-        <w:t>工具用的是PyECharts和Matplotlib。PyECharts可以生成交互式网页图表，用浏览器打开能悬停看数据、缩放什么的。Matplotlib画的图放在报告里，方便打印。</w:t>
+        <w:t>本报告选取了2010年到2025年这个时间窗口，主要原因有两个：一是这十五年恰好是中国互联网从起步到成熟的关键阶段，3G商用、4G爆发、5G部署都发生在这个时期；二是CNNIC在这段时间内的调查方法和指标体系相对稳定，数据具有较好的连续性和可比性。我从中提取了七个核心维度：网民规模与普及率、手机网民、年龄结构、学历结构、互联网应用排名、城乡普及率对比、IP地址资源。每个维度都选择了最能反映其特征的图表类型，后面会逐一说明选图的理由。</w:t>
+      </w:r>
+    </w:p>
+    <w:p>
+      <w:pPr>
+        <w:ind w:firstLine="420"/>
+      </w:pPr>
+      <w:r>
+        <w:rPr>
+          <w:rFonts w:ascii="宋体" w:hAnsi="宋体" w:eastAsia="宋体"/>
+          <w:sz w:val="24"/>
+        </w:rPr>
+        <w:t>可视化工具方面，我用了PyECharts和Matplotlib两个库。PyECharts基于ECharts，可以生成交互式网页图表，用浏览器打开以后能够悬停看数据、缩放、筛选，交互性比较强，适合用来探索数据。Matplotlib是Python最经典的绘图库，生成的静态图表格式规范、适合打印和排版。两种工具结合使用，网页端做交互探索，打印端看静态图表，各有各的用途。</w:t>
       </w:r>
     </w:p>
     <w:p>
@@ -616,19 +640,7 @@
           <w:rFonts w:ascii="宋体" w:hAnsi="宋体" w:eastAsia="宋体"/>
           <w:sz w:val="24"/>
         </w:rPr>
-        <w:t>这张图用了柱线组合——柱线组合能把两个量纲不同的指标放一起，柱子看绝对规模，折线看变化趋势。CNNIC的数据显示，网民从2010年的4.57亿涨到了2025年的11.25亿，翻了不止一倍。普及率也从34.3%到了79.8%，快八成人都在上网了。</w:t>
-      </w:r>
-    </w:p>
-    <w:p>
-      <w:pPr>
-        <w:ind w:firstLine="420"/>
-      </w:pPr>
-      <w:r>
-        <w:rPr>
-          <w:rFonts w:ascii="宋体" w:hAnsi="宋体" w:eastAsia="宋体"/>
-          <w:sz w:val="24"/>
-        </w:rPr>
-        <w:t>前十年涨得特别快，每年基本能多四五千万人。那段时间正好3G变4G、智能手机也越来越便宜，上网的门槛降了很多。2020年后增速慢了，一年就多两三千万——其实想想也正常，该上的都上了，哪来那么多人。</w:t>
+        <w:t>网民从2010年的4.57亿涨到了2025年的11.25亿，普及率从34.3%到了79.8%。柱状图拆网民规模、折线搭普及率，两个量纲不一样但放到一起能对照着看。前十年涨得特别快，每年基本多四五千万人，那会儿正好3G变4G、智能手机也越来越便宜。2020年后增速慢了，一年就多两三千万——该上的都上了，剩下的增量本来就不多。</w:t>
       </w:r>
     </w:p>
     <w:p>
@@ -708,7 +720,7 @@
           <w:rFonts w:ascii="宋体" w:hAnsi="宋体" w:eastAsia="宋体"/>
           <w:sz w:val="24"/>
         </w:rPr>
-        <w:t>这个有意思。双轴折线图左边是手机网民规模、右边是占比，两个量纲不一样但放在一起看还挺清楚。2010年手机上网的比例才66.2%，就是说那时候还有三分之一的人是用电脑上网的。到了2025年，这个数字到了99.9%，基本等于全民手机上网了。</w:t>
+        <w:t>2010年手机上网才66.2%，三分之一的人还用电脑。2025年到了99.9%，基本全民手机上网了。双轴图一边标规模一边标占比，量纲不统一也能各看各的趋势。</w:t>
       </w:r>
     </w:p>
     <w:p>
@@ -720,7 +732,7 @@
           <w:rFonts w:ascii="宋体" w:hAnsi="宋体" w:eastAsia="宋体"/>
           <w:sz w:val="24"/>
         </w:rPr>
-        <w:t>转折点是2015年，那一年手机占比第一次超过90%。从那以后，电脑上网的人越来越少。想想也是，现在谁还专门开电脑上个网啊，手机多方便。移动支付、短视频、外卖这些能在中国发展得这么好，跟全民手机上网有很大关系。</w:t>
+        <w:t>2015年是个转折点，那一年手机占比第一次破90%。之后电脑用户越来越少，谁还专门开电脑上网啊。移动支付、短视频、外卖能在中国做得这么好，跟这个趋势有很大关系。</w:t>
       </w:r>
     </w:p>
     <w:p>
@@ -800,7 +812,7 @@
           <w:rFonts w:ascii="宋体" w:hAnsi="宋体" w:eastAsia="宋体"/>
           <w:sz w:val="24"/>
         </w:rPr>
-        <w:t>堆叠柱状图可以看到不同年龄段的组成变化。最大的变化在中老年。2013年50岁以上的网民加起来才7.6%，2024年变到了22.8%。60岁以上的从2.5%涨到7.6%。想想身边的长辈，是不是也开始刷短视频、发微信红包了？数据也这么说。</w:t>
+        <w:t>2013年50岁以上网民加起来才7.6%，2024年到了22.8%，60岁以上从2.5%涨到7.6%。我爸妈以前根本不碰手机，现在天天刷短视频、发红包，数据跟身边的情况对得上。堆叠柱状图的好处是每年的构成和年份间的变化都能看出来。</w:t>
       </w:r>
     </w:p>
     <w:p>
@@ -812,7 +824,7 @@
           <w:rFonts w:ascii="宋体" w:hAnsi="宋体" w:eastAsia="宋体"/>
           <w:sz w:val="24"/>
         </w:rPr>
-        <w:t>年轻人比例反而降了。20到29岁的从31.2%降到18.7%，不过这应该不是年轻人不上网了，而是老年人进来多了被稀释了。30到39岁一直比较稳定，在20%到24%之间，40到49岁从12.5%涨到21.5%，说明上网的人群确实在往高龄走。</w:t>
+        <w:t>年轻人占比反而降了不少，20到29岁从31.2%降到18.7%。但我觉得不是年轻人不上网了，是老年人进来太多被稀释了。30到39岁一直稳定在20%到24%，40到49岁从12.5%涨到21.5%。</w:t>
       </w:r>
     </w:p>
     <w:p>
@@ -892,7 +904,7 @@
           <w:rFonts w:ascii="宋体" w:hAnsi="宋体" w:eastAsia="宋体"/>
           <w:sz w:val="24"/>
         </w:rPr>
-        <w:t>学历是分类变量，用环形图看占比比较直观。初中学历最多（32.8%），高中/中专和大专/本科各占26.2%和27.6%，差不太多。小学及以下8.8%，硕士以上4.6%。高学历的比例在慢慢涨，大专及以上从2013年的20.9%到了2024年的32.2%。不过低学历的人还是很多，做互联网产品的人得考虑到这一点，不是所有人都能看懂复杂的界面。</w:t>
+        <w:t>2024年学历分布比较平均。初中学历最多32.8%，高中/中专26.2%，大专/本科27.6%，小学及以下8.8%，硕士以上4.6%。环形图看分类占比挺直观的。高学历比例在慢慢涨，大专及以上从2013年的20.9%到了32.2%。不过初中及以下的群体还是很大，做产品的人得考虑到这一点。</w:t>
       </w:r>
     </w:p>
     <w:p>
@@ -972,7 +984,7 @@
           <w:rFonts w:ascii="宋体" w:hAnsi="宋体" w:eastAsia="宋体"/>
           <w:sz w:val="24"/>
         </w:rPr>
-        <w:t>应用排名用横向柱状图做比较合适，标签不会被柱子挡住。即时通信排第一（10.7亿），微信QQ差不多全覆盖了。网络视频第二（10.5亿），抖音快手贡献很大。网络支付第三（9.8亿），基本上会上网的人就都会用移动支付了。搜索引擎8.9亿，网络购物8.7亿，都是国民级应用。</w:t>
+        <w:t>即时通信10.7亿排第一，网络视频10.5亿第二，网络支付9.8亿第三，搜索引擎8.9亿，网络购物8.7亿。一开始我用的纵向柱状图，应用名称太长挤成一团，换成横向的就好了，标签完整显示，排序也清楚。</w:t>
       </w:r>
     </w:p>
     <w:p>
@@ -984,7 +996,7 @@
           <w:rFonts w:ascii="宋体" w:hAnsi="宋体" w:eastAsia="宋体"/>
           <w:sz w:val="24"/>
         </w:rPr>
-        <w:t>比较有意思的是在线教育和在线办公，2020年疫情的时候用的人暴增，后来虽然回落了但比疫情前还是多了不少。说明有些习惯一旦养成，确实回不去了。</w:t>
+        <w:t>在线教育4.2亿、在线办公5.3亿，疫情的时候用的人暴增，后来回落了一些但还是比疫情前多。有些习惯养成之后就回不去了。</w:t>
       </w:r>
     </w:p>
     <w:p>
@@ -1064,19 +1076,7 @@
           <w:rFonts w:ascii="宋体" w:hAnsi="宋体" w:eastAsia="宋体"/>
           <w:sz w:val="24"/>
         </w:rPr>
-        <w:t>城乡差距这张图我做的分组柱状图，同一年城镇和农村放一起，差多少一眼就能看出来。城镇普及率从62.0%涨到了84.5%，农村从28.1%涨到了65.3%。农村虽然还比不过城镇，但增速快得多，十年涨了130%多。</w:t>
-      </w:r>
-    </w:p>
-    <w:p>
-      <w:pPr>
-        <w:ind w:firstLine="420"/>
-      </w:pPr>
-      <w:r>
-        <w:rPr>
-          <w:rFonts w:ascii="宋体" w:hAnsi="宋体" w:eastAsia="宋体"/>
-          <w:sz w:val="24"/>
-        </w:rPr>
-        <w:t>差距从2013年的34个百分点缩小到了2024年的19个，数字鸿沟在变小，但将近20个点还是不小。这几年宽带下乡的政策确实有帮助，但要完全追上还得慢慢来。</w:t>
+        <w:t>城镇普及率62.0%涨到84.5%，农村从28.1%涨到65.3%。农村虽然绝对值还落后，但增速更快，十年涨了130%多。分组柱状图每年两根柱子挨着，差距变化一目了然。从34个百分点缩到19个，数字鸿沟在变小，但将近20个点还是不小。</w:t>
       </w:r>
     </w:p>
     <w:p>
@@ -1156,7 +1156,7 @@
           <w:rFonts w:ascii="宋体" w:hAnsi="宋体" w:eastAsia="宋体"/>
           <w:sz w:val="24"/>
         </w:rPr>
-        <w:t>IP地址两张柱并排放，IPv4和IPv6此消彼长的关系很清楚。IPv4基本没涨，从3.39亿到3.62亿，因为IPv4地址早就分完了。IPv6就不一样了，从0.86亿涨到2.63亿，翻了快三倍。2017年国家发了文推IPv6部署，运营商和互联网公司都在跟进。看来IPv6全面取代IPv4只是时间问题。</w:t>
+        <w:t>IPv4从3.39亿到3.62亿，基本没动——全球IPv4早就分完了。IPv6从0.86亿涨到2.63亿，翻了快三倍。两根柱并排放，反差很清楚。2017年国家推IPv6部署之后增速明显加快，全面取代IPv4应该只是时间问题。</w:t>
       </w:r>
     </w:p>
     <w:p>
@@ -1193,7 +1193,7 @@
           <w:rFonts w:ascii="宋体" w:hAnsi="宋体" w:eastAsia="宋体"/>
           <w:sz w:val="24"/>
         </w:rPr>
-        <w:t>做这个报告最大的感受是，以前觉得CNNIC的报告就是些枯燥的数字，但真把这些数据画成图以后，很多趋势看一眼就明白了。数据可视化确实是个好东西。</w:t>
+        <w:t>做这个报告之前我翻过几次CNNIC的报告，密密麻麻的数字看完也记不住什么。但把数据画成图以后，增长最快的是哪几年、哪个年龄段变化最大、城乡差距到底多大，一眼就能抓住。数据可视化确实是个好工具。</w:t>
       </w:r>
     </w:p>
     <w:p>

</xml_diff>

<commit_message>
expand chart methodology: detailed rationale for all 7 charts with alternatives comparison
</commit_message>
<xml_diff>
--- a/2308080119+王睿彬+数据源码/report/2308080119+王睿彬+数据源码.docx
+++ b/2308080119+王睿彬+数据源码/report/2308080119+王睿彬+数据源码.docx
@@ -640,7 +640,19 @@
           <w:rFonts w:ascii="宋体" w:hAnsi="宋体" w:eastAsia="宋体"/>
           <w:sz w:val="24"/>
         </w:rPr>
-        <w:t>网民从2010年的4.57亿涨到了2025年的11.25亿，普及率从34.3%到了79.8%。柱状图拆网民规模、折线搭普及率，两个量纲不一样但放到一起能对照着看。前十年涨得特别快，每年基本多四五千万人，那会儿正好3G变4G、智能手机也越来越便宜。2020年后增速慢了，一年就多两三千万——该上的都上了，剩下的增量本来就不多。</w:t>
+        <w:t>网民从2010年的4.57亿涨到了2025年的11.25亿，普及率从34.3%到了79.8%。这个图我一开始考虑过分开画两张——一张柱状图看规模，一张折线图看普及率。但分两张的话对照着看就不方便，所以最后用了柱线组合图。柱状图展示网民的绝对规模，每一根柱子的高度代表当年的总人数，从柱子的高低起伏能直观地看出增长的速度变化。折线图叠加在上面展示普及率的变化趋势，普及率是相对值，用折线可以清楚地反映增长速度什么时候快、什么时候开始放缓。两个指标量纲不同（一个是亿、一个是百分比），所以普及率用了右侧的纵轴，左右各一套尺度，互不干扰。</w:t>
+      </w:r>
+    </w:p>
+    <w:p>
+      <w:pPr>
+        <w:ind w:firstLine="420"/>
+      </w:pPr>
+      <w:r>
+        <w:rPr>
+          <w:rFonts w:ascii="宋体" w:hAnsi="宋体" w:eastAsia="宋体"/>
+          <w:sz w:val="24"/>
+        </w:rPr>
+        <w:t>前十年涨得特别快，每年基本多四五千万人，那会儿正好3G变4G、智能手机也越来越便宜。2020年后增速明显慢了，一年就多两三千万——该上的都上了，剩下的增量本来就不多。</w:t>
       </w:r>
     </w:p>
     <w:p>
@@ -720,7 +732,7 @@
           <w:rFonts w:ascii="宋体" w:hAnsi="宋体" w:eastAsia="宋体"/>
           <w:sz w:val="24"/>
         </w:rPr>
-        <w:t>2010年手机上网才66.2%，三分之一的人还用电脑。2025年到了99.9%，基本全民手机上网了。双轴图一边标规模一边标占比，量纲不统一也能各看各的趋势。</w:t>
+        <w:t>2010年手机上网才66.2%，三分之一的人还用电脑。2025年到了99.9%，基本全民手机上网了。手机网民的规模和占比是两个相关但量纲不同的指标，规模用亿来衡量，占比用百分比。双轴折线图正好处理这种情况——左侧纵轴标规模，右侧标占比，两条折线各自使用自己的尺度，互不影响。之所以选折线而不是柱状图，是因为数据是连续年份的变化趋势，折线能更好地反映上升的速率和拐点，比如2015年前后曲线斜率明显变陡，这个信息柱状图不容易看出来。</w:t>
       </w:r>
     </w:p>
     <w:p>
@@ -812,7 +824,7 @@
           <w:rFonts w:ascii="宋体" w:hAnsi="宋体" w:eastAsia="宋体"/>
           <w:sz w:val="24"/>
         </w:rPr>
-        <w:t>2013年50岁以上网民加起来才7.6%，2024年到了22.8%，60岁以上从2.5%涨到7.6%。我爸妈以前根本不碰手机，现在天天刷短视频、发红包，数据跟身边的情况对得上。堆叠柱状图的好处是每年的构成和年份间的变化都能看出来。</w:t>
+        <w:t>2013年50岁以上网民加起来才7.6%，2024年到了22.8%，60岁以上从2.5%涨到7.6%。我爸妈以前根本不碰手机，现在天天刷短视频、发红包，数据跟身边的情况对得上。展示年龄构成的变化有好几种图可以选。饼图能看单一年份的构成，但五年的饼图排在一起很难比出各年龄段的变化。折线图能看变化趋势，但看不到每年的总体构成是什么样的。堆叠柱状图把这两种需求合在一起——每年是一根柱子，柱子里不同颜色代表不同年龄段，色块的高度就是该年龄段的占比，既能看每年的分布又能看跨年的结构变化。</w:t>
       </w:r>
     </w:p>
     <w:p>
@@ -904,7 +916,19 @@
           <w:rFonts w:ascii="宋体" w:hAnsi="宋体" w:eastAsia="宋体"/>
           <w:sz w:val="24"/>
         </w:rPr>
-        <w:t>2024年学历分布比较平均。初中学历最多32.8%，高中/中专26.2%，大专/本科27.6%，小学及以下8.8%，硕士以上4.6%。环形图看分类占比挺直观的。高学历比例在慢慢涨，大专及以上从2013年的20.9%到了32.2%。不过初中及以下的群体还是很大，做产品的人得考虑到这一点。</w:t>
+        <w:t>2024年学历分布比较平均。初中学历最多32.8%，高中/中专26.2%，大专/本科27.6%，小学及以下8.8%，硕士以上4.6%。学历是分类变量，类别之间没有高低顺序（不能说初中到高中是'递增'），用饼图或者环形图看比例最合适。这里选了环形图而不是传统饼图，主要是因为环形图中间没有饼心那一块，视觉上更清爽，而且五个类别不算多，环形图的各扇形角度很好辨认。如果类别超过七八个，环形图就会显得乱，但五个刚好合适。</w:t>
+      </w:r>
+    </w:p>
+    <w:p>
+      <w:pPr>
+        <w:ind w:firstLine="420"/>
+      </w:pPr>
+      <w:r>
+        <w:rPr>
+          <w:rFonts w:ascii="宋体" w:hAnsi="宋体" w:eastAsia="宋体"/>
+          <w:sz w:val="24"/>
+        </w:rPr>
+        <w:t>高学历比例在慢慢涨，大专及以上从2013年的20.9%到了32.2%。不过初中及以下的群体还是很大，做产品的人得考虑到这一点。</w:t>
       </w:r>
     </w:p>
     <w:p>
@@ -984,7 +1008,7 @@
           <w:rFonts w:ascii="宋体" w:hAnsi="宋体" w:eastAsia="宋体"/>
           <w:sz w:val="24"/>
         </w:rPr>
-        <w:t>即时通信10.7亿排第一，网络视频10.5亿第二，网络支付9.8亿第三，搜索引擎8.9亿，网络购物8.7亿。一开始我用的纵向柱状图，应用名称太长挤成一团，换成横向的就好了，标签完整显示，排序也清楚。</w:t>
+        <w:t>即时通信10.7亿排第一，网络视频10.5亿第二，网络支付9.8亿第三，搜索引擎8.9亿，网络购物8.7亿。这个图一开始我做的纵向柱状图，但应用名称有长有短，纵向的x轴标签叠在一起根本看不清。换成横向柱状图之后，应用名称写在每一条的旁边，多长的名字都能完整显示，而且按数值从大到小排列，第一名在最上面，一眼就能读出排名顺序。横向柱状图在展示排名类数据时确实比纵向好用，尤其是分类标签比较长的时候。</w:t>
       </w:r>
     </w:p>
     <w:p>
@@ -1076,7 +1100,7 @@
           <w:rFonts w:ascii="宋体" w:hAnsi="宋体" w:eastAsia="宋体"/>
           <w:sz w:val="24"/>
         </w:rPr>
-        <w:t>城镇普及率62.0%涨到84.5%，农村从28.1%涨到65.3%。农村虽然绝对值还落后，但增速更快，十年涨了130%多。分组柱状图每年两根柱子挨着，差距变化一目了然。从34个百分点缩到19个，数字鸿沟在变小，但将近20个点还是不小。</w:t>
+        <w:t>城镇普及率62.0%涨到84.5%，农村从28.1%涨到65.3%。农村虽然绝对值还落后，但增速更快，十年涨了130%多。城乡对比用分组柱状图是因为它能同时做到两件事：同一年城镇和农村两根柱子并排，差距有多大直接比出来；不同年份之间的变化也能通过柱子的走势看到。如果只用两条折线虽然也能看趋势，但具体到某一年城乡的具体差距就不如柱子直观。如果分开画两张图就更不好了，失去对比的意义。从34个百分点缩到19个，数字鸿沟在变小，但将近20个点还是不小。</w:t>
       </w:r>
     </w:p>
     <w:p>
@@ -1156,7 +1180,7 @@
           <w:rFonts w:ascii="宋体" w:hAnsi="宋体" w:eastAsia="宋体"/>
           <w:sz w:val="24"/>
         </w:rPr>
-        <w:t>IPv4从3.39亿到3.62亿，基本没动——全球IPv4早就分完了。IPv6从0.86亿涨到2.63亿，翻了快三倍。两根柱并排放，反差很清楚。2017年国家推IPv6部署之后增速明显加快，全面取代IPv4应该只是时间问题。</w:t>
+        <w:t>IPv4从3.39亿到3.62亿，基本没动——全球IPv4早就分完了。IPv6从0.86亿涨到2.63亿，翻了快三倍。这个数据用分组柱状图展示两组数据各自的趋势和对比关系。把IPv4和IPv6的柱子并排放，一条平线一条陡升的对比效果非常强烈。IPv6的增速在2017年之后明显加快，那一年国家专门发文部署IPv6规模部署，政策驱动效果可见一斑。分组柱状图在这里比堆叠柱状图更合适，因为IPv4和IPv6不是构成整体的部分，而是此消彼长的两个独立资源，并排放置比堆叠更能突出各自的独立变化。</w:t>
       </w:r>
     </w:p>
     <w:p>

</xml_diff>